<commit_message>
added diagrams and fixed iterator
</commit_message>
<xml_diff>
--- a/Ex03 Daniel 322594508 Hadar 209148535.docx
+++ b/Ex03 Daniel 322594508 Hadar 209148535.docx
@@ -230,7 +230,51 @@
           <w:rtl/>
           <w:lang w:val="en-US"/>
         </w:rPr>
-        <w:t xml:space="preserve"> מצד פייסבוק היה מחייב שינוי בכל לולאה במערכת שלנו. השימוש בתבנית מאפשר לנו לעבור בצורה גנרית על הנתונים. </w:t>
+        <w:t xml:space="preserve"> מצד פייסבוק היה מחייב שינוי בכל לולאה במערכת שלנו. השימוש בתבנית מאפשר לנו לעבור בצורה גנרית על הנתונים.</w:t>
+      </w:r>
+      <w:r>
+        <w:rPr>
+          <w:rFonts w:hint="cs"/>
+          <w:rtl/>
+          <w:lang w:val="en-US"/>
+        </w:rPr>
+        <w:t xml:space="preserve">בנוסף השימוש ב </w:t>
+      </w:r>
+      <w:r>
+        <w:rPr>
+          <w:lang w:val="en-US"/>
+        </w:rPr>
+        <w:t>Aggregate</w:t>
+      </w:r>
+      <w:r>
+        <w:rPr>
+          <w:rFonts w:hint="cs"/>
+          <w:rtl/>
+          <w:lang w:val="en-US"/>
+        </w:rPr>
+        <w:t xml:space="preserve"> מאפשר לנו ליצור את ה</w:t>
+      </w:r>
+      <w:r>
+        <w:rPr>
+          <w:lang w:val="en-US"/>
+        </w:rPr>
+        <w:t>Iterator</w:t>
+      </w:r>
+      <w:r>
+        <w:rPr>
+          <w:rFonts w:hint="cs"/>
+          <w:rtl/>
+          <w:lang w:val="en-US"/>
+        </w:rPr>
+        <w:t xml:space="preserve"> מתוך האוסף </w:t>
+      </w:r>
+      <w:r>
+        <w:rPr>
+          <w:rFonts w:hint="cs"/>
+          <w:rtl/>
+          <w:lang w:val="en-US"/>
+        </w:rPr>
+        <w:t>עצמו ובכך מקטין את התלות במימוש הספציפי של האיטרטור.</w:t>
       </w:r>
       <w:r>
         <w:rPr>
@@ -322,11 +366,103 @@
           <w:rtl/>
           <w:lang w:val="en-US"/>
         </w:rPr>
-        <w:t xml:space="preserve"> ומנהל את המעבר עליהם. ניתן למצוא את המימוש </w:t>
-      </w:r>
+        <w:t xml:space="preserve"> ומנהל את המעבר עליהם. </w:t>
+      </w:r>
+      <w:r>
+        <w:rPr>
+          <w:rFonts w:hint="cs"/>
+          <w:rtl/>
+          <w:lang w:val="en-US"/>
+        </w:rPr>
+        <w:t xml:space="preserve">הגדרנו ממשק  </w:t>
+      </w:r>
+      <w:proofErr w:type="spellStart"/>
+      <w:r>
+        <w:rPr>
+          <w:lang w:val="en-US"/>
+        </w:rPr>
+        <w:t>IAggregate</w:t>
+      </w:r>
+      <w:proofErr w:type="spellEnd"/>
+      <w:r>
+        <w:rPr>
+          <w:lang w:val="en-US"/>
+        </w:rPr>
+        <w:t xml:space="preserve"> </w:t>
+      </w:r>
+      <w:r>
+        <w:rPr>
+          <w:rFonts w:hint="cs"/>
+          <w:rtl/>
+          <w:lang w:val="en-US"/>
+        </w:rPr>
+        <w:t xml:space="preserve">  שמכיל את </w:t>
+      </w:r>
+      <w:proofErr w:type="spellStart"/>
+      <w:r>
+        <w:rPr>
+          <w:lang w:val="en-US"/>
+        </w:rPr>
+        <w:t>createIterator</w:t>
+      </w:r>
+      <w:proofErr w:type="spellEnd"/>
+      <w:r>
+        <w:rPr>
+          <w:lang w:val="en-US"/>
+        </w:rPr>
+        <w:t>()</w:t>
+      </w:r>
+      <w:r>
+        <w:rPr>
+          <w:rFonts w:hint="cs"/>
+          <w:rtl/>
+          <w:lang w:val="en-US"/>
+        </w:rPr>
+        <w:t xml:space="preserve"> ויצרנו מחלקה </w:t>
+      </w:r>
+      <w:proofErr w:type="spellStart"/>
+      <w:r>
+        <w:rPr>
+          <w:lang w:val="en-US"/>
+        </w:rPr>
+        <w:t>FacebookObjectCollection</w:t>
+      </w:r>
+      <w:proofErr w:type="spellEnd"/>
+      <w:r>
+        <w:rPr>
+          <w:rFonts w:hint="cs"/>
+          <w:rtl/>
+          <w:lang w:val="en-US"/>
+        </w:rPr>
+        <w:t xml:space="preserve"> שמממשת אותו. המחלקה מייצרת את האיטרטור. ה </w:t>
+      </w:r>
+      <w:r>
+        <w:rPr>
+          <w:lang w:val="en-US"/>
+        </w:rPr>
+        <w:t>facades</w:t>
+      </w:r>
+      <w:r>
+        <w:rPr>
+          <w:rFonts w:hint="cs"/>
+          <w:rtl/>
+          <w:lang w:val="en-US"/>
+        </w:rPr>
+        <w:t xml:space="preserve"> משתמשים בה כדי לקבל את האיטרטור. </w:t>
+      </w:r>
+      <w:r>
+        <w:rPr>
+          <w:rFonts w:hint="cs"/>
+          <w:rtl/>
+          <w:lang w:val="en-US"/>
+        </w:rPr>
+        <w:t xml:space="preserve">ניתן למצוא את המימוש </w:t>
+      </w:r>
+      <w:proofErr w:type="spellStart"/>
       <w:r>
         <w:t>IIterator.cs</w:t>
       </w:r>
+      <w:proofErr w:type="spellEnd"/>
       <w:r>
         <w:rPr>
           <w:rFonts w:hint="cs"/>
@@ -334,9 +470,11 @@
         </w:rPr>
         <w:t xml:space="preserve"> </w:t>
       </w:r>
+      <w:proofErr w:type="spellStart"/>
       <w:r>
         <w:t>FacebookListIterator.cs</w:t>
       </w:r>
+      <w:proofErr w:type="spellEnd"/>
       <w:r>
         <w:rPr>
           <w:rFonts w:hint="cs"/>
@@ -344,9 +482,11 @@
         </w:rPr>
         <w:t xml:space="preserve"> </w:t>
       </w:r>
+      <w:proofErr w:type="spellStart"/>
       <w:r>
         <w:t>FacadeUserInfo</w:t>
       </w:r>
+      <w:proofErr w:type="spellEnd"/>
       <w:r>
         <w:rPr>
           <w:rFonts w:hint="cs"/>
@@ -354,9 +494,11 @@
         </w:rPr>
         <w:t xml:space="preserve"> </w:t>
       </w:r>
+      <w:proofErr w:type="spellStart"/>
       <w:r>
         <w:t>FacadeUserStatistics</w:t>
       </w:r>
+      <w:proofErr w:type="spellEnd"/>
       <w:r>
         <w:rPr>
           <w:rFonts w:hint="cs"/>
@@ -364,9 +506,11 @@
         </w:rPr>
         <w:t xml:space="preserve"> </w:t>
       </w:r>
+      <w:proofErr w:type="spellStart"/>
       <w:r>
         <w:t>FacadeProfile.cs</w:t>
       </w:r>
+      <w:proofErr w:type="spellEnd"/>
       <w:r>
         <w:rPr>
           <w:rFonts w:hint="cs"/>
@@ -374,9 +518,11 @@
         </w:rPr>
         <w:t xml:space="preserve"> </w:t>
       </w:r>
+      <w:proofErr w:type="spellStart"/>
       <w:r>
         <w:t>FacadeCollageOfPhotos.cs</w:t>
       </w:r>
+      <w:proofErr w:type="spellEnd"/>
       <w:r>
         <w:rPr>
           <w:rFonts w:hint="cs"/>
@@ -384,14 +530,33 @@
         </w:rPr>
         <w:t xml:space="preserve"> </w:t>
       </w:r>
+      <w:proofErr w:type="spellStart"/>
+      <w:r>
+        <w:rPr>
+          <w:lang w:val="en-US"/>
+        </w:rPr>
+        <w:t>IAggregate.cs</w:t>
+      </w:r>
+      <w:proofErr w:type="spellEnd"/>
+      <w:r>
+        <w:rPr>
+          <w:lang w:val="en-US"/>
+        </w:rPr>
+        <w:t xml:space="preserve"> </w:t>
+      </w:r>
+      <w:proofErr w:type="spellStart"/>
+      <w:r>
+        <w:rPr>
+          <w:lang w:val="en-US"/>
+        </w:rPr>
+        <w:t>FacebookObjectCollection.cs</w:t>
+      </w:r>
+      <w:proofErr w:type="spellEnd"/>
     </w:p>
     <w:p>
       <w:pPr>
         <w:spacing w:after="0" w:line="240" w:lineRule="auto"/>
         <w:ind w:right="720"/>
-        <w:rPr>
-          <w:rFonts w:hint="cs"/>
-        </w:rPr>
       </w:pPr>
     </w:p>
     <w:p>
@@ -408,18 +573,130 @@
     </w:p>
     <w:p>
       <w:pPr>
-        <w:spacing w:after="0" w:line="240" w:lineRule="auto"/>
-        <w:ind w:right="720"/>
-      </w:pPr>
-      <w:r>
-        <w:t>[sequence diagram</w:t>
-      </w:r>
-      <w:r>
-        <w:rPr>
-          <w:rtl/>
-        </w:rPr>
-        <w:t xml:space="preserve"> שמציגה את התהליך שקשור לתבנית והאינטראקציה בין המחלקות]</w:t>
-      </w:r>
+        <w:pStyle w:val="ListParagraph"/>
+      </w:pPr>
+    </w:p>
+    <w:p>
+      <w:pPr>
+        <w:pStyle w:val="ListParagraph"/>
+      </w:pPr>
+      <w:r>
+        <w:rPr>
+          <w:rtl/>
+        </w:rPr>
+        <w:drawing>
+          <wp:anchor distT="0" distB="0" distL="114300" distR="114300" simplePos="0" relativeHeight="251658240" behindDoc="0" locked="0" layoutInCell="1" allowOverlap="1" wp14:anchorId="3313DFD7" wp14:editId="5B608616">
+            <wp:simplePos x="0" y="0"/>
+            <wp:positionH relativeFrom="column">
+              <wp:posOffset>366395</wp:posOffset>
+            </wp:positionH>
+            <wp:positionV relativeFrom="paragraph">
+              <wp:posOffset>7620</wp:posOffset>
+            </wp:positionV>
+            <wp:extent cx="4528820" cy="3947795"/>
+            <wp:effectExtent l="0" t="0" r="5080" b="0"/>
+            <wp:wrapSquare wrapText="bothSides"/>
+            <wp:docPr id="496411620" name="Picture 1"/>
+            <wp:cNvGraphicFramePr>
+              <a:graphicFrameLocks xmlns:a="http://schemas.openxmlformats.org/drawingml/2006/main" noChangeAspect="1"/>
+            </wp:cNvGraphicFramePr>
+            <a:graphic xmlns:a="http://schemas.openxmlformats.org/drawingml/2006/main">
+              <a:graphicData uri="http://schemas.openxmlformats.org/drawingml/2006/picture">
+                <pic:pic xmlns:pic="http://schemas.openxmlformats.org/drawingml/2006/picture">
+                  <pic:nvPicPr>
+                    <pic:cNvPr id="496411620" name=""/>
+                    <pic:cNvPicPr/>
+                  </pic:nvPicPr>
+                  <pic:blipFill>
+                    <a:blip r:embed="rId9">
+                      <a:extLst>
+                        <a:ext uri="{28A0092B-C50C-407E-A947-70E740481C1C}">
+                          <a14:useLocalDpi xmlns:a14="http://schemas.microsoft.com/office/drawing/2010/main" val="0"/>
+                        </a:ext>
+                      </a:extLst>
+                    </a:blip>
+                    <a:stretch>
+                      <a:fillRect/>
+                    </a:stretch>
+                  </pic:blipFill>
+                  <pic:spPr>
+                    <a:xfrm>
+                      <a:off x="0" y="0"/>
+                      <a:ext cx="4528820" cy="3947795"/>
+                    </a:xfrm>
+                    <a:prstGeom prst="rect">
+                      <a:avLst/>
+                    </a:prstGeom>
+                  </pic:spPr>
+                </pic:pic>
+              </a:graphicData>
+            </a:graphic>
+            <wp14:sizeRelH relativeFrom="margin">
+              <wp14:pctWidth>0</wp14:pctWidth>
+            </wp14:sizeRelH>
+            <wp14:sizeRelV relativeFrom="margin">
+              <wp14:pctHeight>0</wp14:pctHeight>
+            </wp14:sizeRelV>
+          </wp:anchor>
+        </w:drawing>
+      </w:r>
+    </w:p>
+    <w:p>
+      <w:pPr>
+        <w:pStyle w:val="ListParagraph"/>
+      </w:pPr>
+    </w:p>
+    <w:p>
+      <w:pPr>
+        <w:pStyle w:val="ListParagraph"/>
+      </w:pPr>
+    </w:p>
+    <w:p>
+      <w:pPr>
+        <w:pStyle w:val="ListParagraph"/>
+      </w:pPr>
+    </w:p>
+    <w:p>
+      <w:pPr>
+        <w:pStyle w:val="ListParagraph"/>
+      </w:pPr>
+    </w:p>
+    <w:p>
+      <w:pPr>
+        <w:pStyle w:val="ListParagraph"/>
+      </w:pPr>
+    </w:p>
+    <w:p>
+      <w:pPr>
+        <w:pStyle w:val="ListParagraph"/>
+      </w:pPr>
+    </w:p>
+    <w:p>
+      <w:pPr>
+        <w:pStyle w:val="ListParagraph"/>
+      </w:pPr>
+    </w:p>
+    <w:p>
+      <w:pPr>
+        <w:pStyle w:val="ListParagraph"/>
+        <w:rPr>
+          <w:rFonts w:hint="cs"/>
+          <w:rtl/>
+        </w:rPr>
+      </w:pPr>
+    </w:p>
+    <w:p>
+      <w:pPr>
+        <w:spacing w:after="0" w:line="240" w:lineRule="auto"/>
+        <w:rPr>
+          <w:lang w:val="en-US"/>
+        </w:rPr>
+      </w:pPr>
+    </w:p>
+    <w:p>
+      <w:pPr>
+        <w:spacing w:after="0" w:line="240" w:lineRule="auto"/>
+      </w:pPr>
     </w:p>
     <w:p>
       <w:pPr>
@@ -436,6 +713,7 @@
         <w:spacing w:after="0" w:line="240" w:lineRule="auto"/>
       </w:pPr>
       <w:r>
+        <w:lastRenderedPageBreak/>
         <w:t>Class Diagram</w:t>
       </w:r>
       <w:r>
@@ -447,41 +725,65 @@
         <w:spacing w:after="0" w:line="240" w:lineRule="auto"/>
         <w:ind w:right="720"/>
       </w:pPr>
-      <w:r>
-        <w:t>[class diagram</w:t>
-      </w:r>
-      <w:r>
-        <w:rPr>
-          <w:rtl/>
-        </w:rPr>
-        <w:t xml:space="preserve"> שמתארת את המחלקות שלכם שמעורבות בתבנית (תיאור מלא שכולל </w:t>
-      </w:r>
-      <w:r>
-        <w:t>Properties</w:t>
-      </w:r>
-      <w:r>
-        <w:rPr>
-          <w:rtl/>
-        </w:rPr>
-        <w:t xml:space="preserve"> ו- </w:t>
-      </w:r>
-      <w:r>
-        <w:t>Methods</w:t>
-      </w:r>
-      <w:r>
-        <w:rPr>
-          <w:rtl/>
-        </w:rPr>
-        <w:t>) והיחסים ביניהם (תאור מלא עבור כל יחס כפי שלמדנו בכיתה). עבור כל מחלקה שלכם, כיתבו מי המקבילה שלה (אם יש כזו) בתבנית (</w:t>
-      </w:r>
-      <w:r>
-        <w:t>Pattern</w:t>
-      </w:r>
-      <w:r>
-        <w:rPr>
-          <w:rtl/>
-        </w:rPr>
-        <w:t>) שבחרתם</w:t>
+    </w:p>
+    <w:p>
+      <w:pPr>
+        <w:spacing w:after="0" w:line="240" w:lineRule="auto"/>
+        <w:ind w:right="720"/>
+      </w:pPr>
+      <w:r>
+        <w:rPr>
+          <w:rtl/>
+        </w:rPr>
+        <w:drawing>
+          <wp:anchor distT="0" distB="0" distL="114300" distR="114300" simplePos="0" relativeHeight="251659264" behindDoc="0" locked="0" layoutInCell="1" allowOverlap="1" wp14:anchorId="14DB7FAD" wp14:editId="48C54356">
+            <wp:simplePos x="0" y="0"/>
+            <wp:positionH relativeFrom="column">
+              <wp:posOffset>-5316</wp:posOffset>
+            </wp:positionH>
+            <wp:positionV relativeFrom="paragraph">
+              <wp:posOffset>-650</wp:posOffset>
+            </wp:positionV>
+            <wp:extent cx="5274310" cy="3561715"/>
+            <wp:effectExtent l="0" t="0" r="2540" b="635"/>
+            <wp:wrapSquare wrapText="bothSides"/>
+            <wp:docPr id="1753597830" name="Picture 1"/>
+            <wp:cNvGraphicFramePr>
+              <a:graphicFrameLocks xmlns:a="http://schemas.openxmlformats.org/drawingml/2006/main" noChangeAspect="1"/>
+            </wp:cNvGraphicFramePr>
+            <a:graphic xmlns:a="http://schemas.openxmlformats.org/drawingml/2006/main">
+              <a:graphicData uri="http://schemas.openxmlformats.org/drawingml/2006/picture">
+                <pic:pic xmlns:pic="http://schemas.openxmlformats.org/drawingml/2006/picture">
+                  <pic:nvPicPr>
+                    <pic:cNvPr id="1753597830" name=""/>
+                    <pic:cNvPicPr/>
+                  </pic:nvPicPr>
+                  <pic:blipFill>
+                    <a:blip r:embed="rId10" cstate="print">
+                      <a:extLst>
+                        <a:ext uri="{28A0092B-C50C-407E-A947-70E740481C1C}">
+                          <a14:useLocalDpi xmlns:a14="http://schemas.microsoft.com/office/drawing/2010/main" val="0"/>
+                        </a:ext>
+                      </a:extLst>
+                    </a:blip>
+                    <a:stretch>
+                      <a:fillRect/>
+                    </a:stretch>
+                  </pic:blipFill>
+                  <pic:spPr>
+                    <a:xfrm>
+                      <a:off x="0" y="0"/>
+                      <a:ext cx="5274310" cy="3561715"/>
+                    </a:xfrm>
+                    <a:prstGeom prst="rect">
+                      <a:avLst/>
+                    </a:prstGeom>
+                  </pic:spPr>
+                </pic:pic>
+              </a:graphicData>
+            </a:graphic>
+          </wp:anchor>
+        </w:drawing>
       </w:r>
     </w:p>
     <w:p>
@@ -623,7 +925,6 @@
         <w:spacing w:after="0" w:line="240" w:lineRule="auto"/>
         <w:ind w:left="720"/>
         <w:rPr>
-          <w:rFonts w:hint="cs"/>
           <w:rtl/>
         </w:rPr>
       </w:pPr>
@@ -668,7 +969,6 @@
         <w:spacing w:after="0" w:line="240" w:lineRule="auto"/>
         <w:ind w:left="720"/>
         <w:rPr>
-          <w:rFonts w:hint="cs"/>
           <w:rtl/>
         </w:rPr>
       </w:pPr>
@@ -739,7 +1039,6 @@
         <w:spacing w:after="0" w:line="240" w:lineRule="auto"/>
         <w:ind w:left="720"/>
         <w:rPr>
-          <w:rFonts w:hint="cs"/>
           <w:rtl/>
         </w:rPr>
       </w:pPr>
@@ -774,7 +1073,6 @@
         <w:spacing w:after="0" w:line="240" w:lineRule="auto"/>
         <w:ind w:left="720"/>
         <w:rPr>
-          <w:rFonts w:hint="cs"/>
           <w:rtl/>
         </w:rPr>
       </w:pPr>
@@ -821,7 +1119,6 @@
         <w:spacing w:after="0" w:line="240" w:lineRule="auto"/>
         <w:ind w:left="720"/>
         <w:rPr>
-          <w:rFonts w:hint="cs"/>
           <w:rtl/>
         </w:rPr>
       </w:pPr>
@@ -876,16 +1173,14 @@
         <w:spacing w:after="0" w:line="240" w:lineRule="auto"/>
         <w:ind w:left="720"/>
         <w:rPr>
-          <w:rFonts w:hint="cs"/>
-          <w:rtl/>
-        </w:rPr>
-      </w:pPr>
-      <w:r>
-        <w:rPr>
-          <w:rFonts w:hint="cs"/>
-          <w:rtl/>
-        </w:rPr>
-        <w:lastRenderedPageBreak/>
+          <w:rtl/>
+        </w:rPr>
+      </w:pPr>
+      <w:r>
+        <w:rPr>
+          <w:rFonts w:hint="cs"/>
+          <w:rtl/>
+        </w:rPr>
         <w:t>המימוש נמצא בקבצי ה-</w:t>
       </w:r>
       <w:r>
@@ -927,8 +1222,49 @@
       <w:pPr>
         <w:spacing w:after="0" w:line="240" w:lineRule="auto"/>
         <w:ind w:left="720"/>
-        <w:rPr>
-          <w:rFonts w:hint="cs"/>
+      </w:pPr>
+    </w:p>
+    <w:p>
+      <w:pPr>
+        <w:spacing w:after="0" w:line="240" w:lineRule="auto"/>
+        <w:ind w:left="720"/>
+      </w:pPr>
+    </w:p>
+    <w:p>
+      <w:pPr>
+        <w:spacing w:after="0" w:line="240" w:lineRule="auto"/>
+        <w:ind w:left="720"/>
+      </w:pPr>
+    </w:p>
+    <w:p>
+      <w:pPr>
+        <w:spacing w:after="0" w:line="240" w:lineRule="auto"/>
+        <w:ind w:left="720"/>
+      </w:pPr>
+    </w:p>
+    <w:p>
+      <w:pPr>
+        <w:spacing w:after="0" w:line="240" w:lineRule="auto"/>
+        <w:ind w:left="720"/>
+      </w:pPr>
+    </w:p>
+    <w:p>
+      <w:pPr>
+        <w:spacing w:after="0" w:line="240" w:lineRule="auto"/>
+        <w:ind w:left="720"/>
+      </w:pPr>
+    </w:p>
+    <w:p>
+      <w:pPr>
+        <w:spacing w:after="0" w:line="240" w:lineRule="auto"/>
+        <w:ind w:left="720"/>
+      </w:pPr>
+    </w:p>
+    <w:p>
+      <w:pPr>
+        <w:spacing w:after="0" w:line="240" w:lineRule="auto"/>
+        <w:ind w:left="720"/>
+        <w:rPr>
           <w:rtl/>
         </w:rPr>
       </w:pPr>
@@ -942,6 +1278,66 @@
         <w:spacing w:after="0" w:line="240" w:lineRule="auto"/>
       </w:pPr>
       <w:r>
+        <w:rPr>
+          <w:rtl/>
+        </w:rPr>
+        <w:drawing>
+          <wp:anchor distT="0" distB="0" distL="114300" distR="114300" simplePos="0" relativeHeight="251663360" behindDoc="0" locked="0" layoutInCell="1" allowOverlap="1" wp14:anchorId="3D927A83" wp14:editId="7A3E5323">
+            <wp:simplePos x="0" y="0"/>
+            <wp:positionH relativeFrom="column">
+              <wp:posOffset>556895</wp:posOffset>
+            </wp:positionH>
+            <wp:positionV relativeFrom="paragraph">
+              <wp:posOffset>304165</wp:posOffset>
+            </wp:positionV>
+            <wp:extent cx="4479925" cy="2751455"/>
+            <wp:effectExtent l="0" t="0" r="0" b="0"/>
+            <wp:wrapSquare wrapText="bothSides"/>
+            <wp:docPr id="2067091044" name="Picture 1"/>
+            <wp:cNvGraphicFramePr>
+              <a:graphicFrameLocks xmlns:a="http://schemas.openxmlformats.org/drawingml/2006/main" noChangeAspect="1"/>
+            </wp:cNvGraphicFramePr>
+            <a:graphic xmlns:a="http://schemas.openxmlformats.org/drawingml/2006/main">
+              <a:graphicData uri="http://schemas.openxmlformats.org/drawingml/2006/picture">
+                <pic:pic xmlns:pic="http://schemas.openxmlformats.org/drawingml/2006/picture">
+                  <pic:nvPicPr>
+                    <pic:cNvPr id="2067091044" name=""/>
+                    <pic:cNvPicPr/>
+                  </pic:nvPicPr>
+                  <pic:blipFill>
+                    <a:blip r:embed="rId11" cstate="print">
+                      <a:extLst>
+                        <a:ext uri="{28A0092B-C50C-407E-A947-70E740481C1C}">
+                          <a14:useLocalDpi xmlns:a14="http://schemas.microsoft.com/office/drawing/2010/main" val="0"/>
+                        </a:ext>
+                      </a:extLst>
+                    </a:blip>
+                    <a:stretch>
+                      <a:fillRect/>
+                    </a:stretch>
+                  </pic:blipFill>
+                  <pic:spPr>
+                    <a:xfrm>
+                      <a:off x="0" y="0"/>
+                      <a:ext cx="4479925" cy="2751455"/>
+                    </a:xfrm>
+                    <a:prstGeom prst="rect">
+                      <a:avLst/>
+                    </a:prstGeom>
+                  </pic:spPr>
+                </pic:pic>
+              </a:graphicData>
+            </a:graphic>
+            <wp14:sizeRelH relativeFrom="margin">
+              <wp14:pctWidth>0</wp14:pctWidth>
+            </wp14:sizeRelH>
+            <wp14:sizeRelV relativeFrom="margin">
+              <wp14:pctHeight>0</wp14:pctHeight>
+            </wp14:sizeRelV>
+          </wp:anchor>
+        </w:drawing>
+      </w:r>
+      <w:r>
         <w:t>Sequence Diagram</w:t>
       </w:r>
     </w:p>
@@ -950,16 +1346,18 @@
         <w:spacing w:after="0" w:line="240" w:lineRule="auto"/>
         <w:ind w:right="720"/>
       </w:pPr>
-      <w:r>
-        <w:t>[sequence diagram</w:t>
-      </w:r>
-      <w:r>
-        <w:rPr>
-          <w:rFonts w:hint="cs"/>
-          <w:rtl/>
-        </w:rPr>
-        <w:t xml:space="preserve"> שמציגה את התהליך שקשור לתבנית והאינטראקציה בין המחלקות]</w:t>
-      </w:r>
+    </w:p>
+    <w:p>
+      <w:pPr>
+        <w:spacing w:after="0" w:line="240" w:lineRule="auto"/>
+        <w:ind w:right="720"/>
+      </w:pPr>
+    </w:p>
+    <w:p>
+      <w:pPr>
+        <w:spacing w:after="0" w:line="240" w:lineRule="auto"/>
+        <w:ind w:right="720"/>
+      </w:pPr>
     </w:p>
     <w:p>
       <w:pPr>
@@ -988,44 +1386,64 @@
         <w:ind w:right="720"/>
       </w:pPr>
       <w:r>
-        <w:t>[class diagram</w:t>
-      </w:r>
-      <w:r>
-        <w:rPr>
-          <w:rFonts w:hint="cs"/>
-          <w:rtl/>
-        </w:rPr>
-        <w:t xml:space="preserve"> שמתארת את המחלקות שלכם שמעורבות בתבנית (תיאור מלא שכולל </w:t>
-      </w:r>
-      <w:r>
-        <w:t>Properties</w:t>
-      </w:r>
-      <w:r>
-        <w:rPr>
-          <w:rFonts w:hint="cs"/>
-          <w:rtl/>
-        </w:rPr>
-        <w:t xml:space="preserve"> ו- </w:t>
-      </w:r>
-      <w:r>
-        <w:t>Methods</w:t>
-      </w:r>
-      <w:r>
-        <w:rPr>
-          <w:rFonts w:hint="cs"/>
-          <w:rtl/>
-        </w:rPr>
-        <w:t>) והיחסים ביניהם (תאור מלא עבור כל יחס כפי שלמדנו בכיתה). עבור כל מחלקה שלכם, כיתבו מי המקבילה שלה (אם יש כזו) בתבנית (</w:t>
-      </w:r>
-      <w:r>
-        <w:t>Pattern</w:t>
-      </w:r>
-      <w:r>
-        <w:rPr>
-          <w:rFonts w:hint="cs"/>
-          <w:rtl/>
-        </w:rPr>
-        <w:t>) שבחרתם</w:t>
+        <w:rPr>
+          <w:rtl/>
+        </w:rPr>
+        <w:drawing>
+          <wp:anchor distT="0" distB="0" distL="114300" distR="114300" simplePos="0" relativeHeight="251662336" behindDoc="0" locked="0" layoutInCell="1" allowOverlap="1" wp14:anchorId="6EC1DE81" wp14:editId="5B749034">
+            <wp:simplePos x="0" y="0"/>
+            <wp:positionH relativeFrom="column">
+              <wp:posOffset>-850265</wp:posOffset>
+            </wp:positionH>
+            <wp:positionV relativeFrom="paragraph">
+              <wp:posOffset>254635</wp:posOffset>
+            </wp:positionV>
+            <wp:extent cx="6611620" cy="3329305"/>
+            <wp:effectExtent l="0" t="0" r="0" b="4445"/>
+            <wp:wrapSquare wrapText="bothSides"/>
+            <wp:docPr id="1545991782" name="Picture 1"/>
+            <wp:cNvGraphicFramePr>
+              <a:graphicFrameLocks xmlns:a="http://schemas.openxmlformats.org/drawingml/2006/main" noChangeAspect="1"/>
+            </wp:cNvGraphicFramePr>
+            <a:graphic xmlns:a="http://schemas.openxmlformats.org/drawingml/2006/main">
+              <a:graphicData uri="http://schemas.openxmlformats.org/drawingml/2006/picture">
+                <pic:pic xmlns:pic="http://schemas.openxmlformats.org/drawingml/2006/picture">
+                  <pic:nvPicPr>
+                    <pic:cNvPr id="1545991782" name=""/>
+                    <pic:cNvPicPr/>
+                  </pic:nvPicPr>
+                  <pic:blipFill>
+                    <a:blip r:embed="rId12">
+                      <a:extLst>
+                        <a:ext uri="{28A0092B-C50C-407E-A947-70E740481C1C}">
+                          <a14:useLocalDpi xmlns:a14="http://schemas.microsoft.com/office/drawing/2010/main" val="0"/>
+                        </a:ext>
+                      </a:extLst>
+                    </a:blip>
+                    <a:stretch>
+                      <a:fillRect/>
+                    </a:stretch>
+                  </pic:blipFill>
+                  <pic:spPr>
+                    <a:xfrm>
+                      <a:off x="0" y="0"/>
+                      <a:ext cx="6611620" cy="3329305"/>
+                    </a:xfrm>
+                    <a:prstGeom prst="rect">
+                      <a:avLst/>
+                    </a:prstGeom>
+                  </pic:spPr>
+                </pic:pic>
+              </a:graphicData>
+            </a:graphic>
+            <wp14:sizeRelH relativeFrom="margin">
+              <wp14:pctWidth>0</wp14:pctWidth>
+            </wp14:sizeRelH>
+            <wp14:sizeRelV relativeFrom="margin">
+              <wp14:pctHeight>0</wp14:pctHeight>
+            </wp14:sizeRelV>
+          </wp:anchor>
+        </w:drawing>
       </w:r>
     </w:p>
     <w:p>
@@ -1034,6 +1452,12 @@
         <w:ind w:right="720"/>
       </w:pPr>
     </w:p>
+    <w:p/>
+    <w:p/>
+    <w:p/>
+    <w:p/>
+    <w:p/>
+    <w:p/>
     <w:p/>
     <w:p>
       <w:pPr>
@@ -1063,17 +1487,40 @@
         </w:rPr>
         <w:t>סיבת הבחירה / שימוש בתבנית:</w:t>
       </w:r>
-    </w:p>
-    <w:p>
-      <w:pPr>
-        <w:spacing w:after="0" w:line="240" w:lineRule="auto"/>
-        <w:ind w:right="720"/>
-      </w:pPr>
-      <w:r>
-        <w:rPr>
-          <w:rtl/>
-        </w:rPr>
-        <w:t>[תיאור הסיבה / הצורך בשימוש בתבנית במערכת שלכם]</w:t>
+      <w:r>
+        <w:rPr>
+          <w:rFonts w:hint="cs"/>
+          <w:rtl/>
+        </w:rPr>
+        <w:t xml:space="preserve">בחרנו בתבנית </w:t>
+      </w:r>
+      <w:r>
+        <w:rPr>
+          <w:lang w:val="en-US"/>
+        </w:rPr>
+        <w:t>Strategy</w:t>
+      </w:r>
+      <w:r>
+        <w:rPr>
+          <w:rFonts w:hint="cs"/>
+          <w:rtl/>
+          <w:lang w:val="en-US"/>
+        </w:rPr>
+        <w:t xml:space="preserve"> כדי לאפשר למשתמש לשנות באופן דינמי את האלבומים, אפשרות מיון לפי שם האלבום או לפי מספר התמונות בו. השימוש בתבנית מאפשר קוד פשוט יותר כך שאם בעתיד נרצה להוסיף שיטות מיון חדשות לא נצטרך לשנות את הקוד הקיים ב</w:t>
+      </w:r>
+      <w:r>
+        <w:rPr>
+          <w:lang w:val="en-US"/>
+        </w:rPr>
+        <w:t>Facade</w:t>
+      </w:r>
+      <w:r>
+        <w:rPr>
+          <w:rFonts w:hint="cs"/>
+          <w:rtl/>
+          <w:lang w:val="en-US"/>
+        </w:rPr>
+        <w:t>.</w:t>
       </w:r>
       <w:r>
         <w:rPr>
@@ -1096,17 +1543,65 @@
         </w:rPr>
         <w:t>אופן המימוש:</w:t>
       </w:r>
-    </w:p>
-    <w:p>
-      <w:pPr>
-        <w:spacing w:after="0" w:line="240" w:lineRule="auto"/>
-        <w:ind w:right="720"/>
-      </w:pPr>
-      <w:r>
-        <w:rPr>
-          <w:rtl/>
-        </w:rPr>
-        <w:t>[תיאור המימוש והיכן ניתן למצוא אותו בקוד]</w:t>
+      <w:proofErr w:type="spellStart"/>
+      <w:r>
+        <w:rPr>
+          <w:lang w:val="en-US"/>
+        </w:rPr>
+        <w:t>ISortStrategy</w:t>
+      </w:r>
+      <w:proofErr w:type="spellEnd"/>
+      <w:r>
+        <w:rPr>
+          <w:rFonts w:hint="cs"/>
+          <w:rtl/>
+          <w:lang w:val="en-US"/>
+        </w:rPr>
+        <w:t xml:space="preserve"> ממשק שמגדיר את </w:t>
+      </w:r>
+      <w:r>
+        <w:rPr>
+          <w:lang w:val="en-US"/>
+        </w:rPr>
+        <w:t xml:space="preserve">Sort </w:t>
+      </w:r>
+      <w:r>
+        <w:rPr>
+          <w:rFonts w:hint="cs"/>
+          <w:rtl/>
+          <w:lang w:val="en-US"/>
+        </w:rPr>
+        <w:t xml:space="preserve"> מקבל רשימת אלבומים ומחזיר רשימה ממוינת. מחלקות שמממשות את הממשק </w:t>
+      </w:r>
+      <w:proofErr w:type="spellStart"/>
+      <w:r>
+        <w:rPr>
+          <w:lang w:val="en-US"/>
+        </w:rPr>
+        <w:t>SortByName</w:t>
+      </w:r>
+      <w:proofErr w:type="spellEnd"/>
+      <w:r>
+        <w:rPr>
+          <w:lang w:val="en-US"/>
+        </w:rPr>
+        <w:t xml:space="preserve"> </w:t>
+      </w:r>
+      <w:proofErr w:type="spellStart"/>
+      <w:r>
+        <w:rPr>
+          <w:lang w:val="en-US"/>
+        </w:rPr>
+        <w:t>SortBySize</w:t>
+      </w:r>
+      <w:proofErr w:type="spellEnd"/>
+      <w:r>
+        <w:rPr>
+          <w:rFonts w:hint="cs"/>
+          <w:rtl/>
+          <w:lang w:val="en-US"/>
+        </w:rPr>
+        <w:t xml:space="preserve"> הממיינות את האלבומים.</w:t>
       </w:r>
     </w:p>
     <w:p>
@@ -1133,14 +1628,191 @@
         <w:ind w:right="720"/>
       </w:pPr>
       <w:r>
-        <w:t>[sequence diagram</w:t>
-      </w:r>
-      <w:r>
-        <w:rPr>
-          <w:rtl/>
-        </w:rPr>
-        <w:t xml:space="preserve"> שמציגה את התהליך שקשור לתבנית והאינטראקציה בין המחלקות]</w:t>
-      </w:r>
+        <w:rPr>
+          <w:rtl/>
+        </w:rPr>
+        <w:drawing>
+          <wp:anchor distT="0" distB="0" distL="114300" distR="114300" simplePos="0" relativeHeight="251661312" behindDoc="0" locked="0" layoutInCell="1" allowOverlap="1" wp14:anchorId="4E9F085E" wp14:editId="774F52F3">
+            <wp:simplePos x="0" y="0"/>
+            <wp:positionH relativeFrom="column">
+              <wp:posOffset>313203</wp:posOffset>
+            </wp:positionH>
+            <wp:positionV relativeFrom="paragraph">
+              <wp:posOffset>98440</wp:posOffset>
+            </wp:positionV>
+            <wp:extent cx="3986530" cy="3737610"/>
+            <wp:effectExtent l="0" t="0" r="0" b="0"/>
+            <wp:wrapSquare wrapText="bothSides"/>
+            <wp:docPr id="1065458833" name="Picture 1"/>
+            <wp:cNvGraphicFramePr>
+              <a:graphicFrameLocks xmlns:a="http://schemas.openxmlformats.org/drawingml/2006/main" noChangeAspect="1"/>
+            </wp:cNvGraphicFramePr>
+            <a:graphic xmlns:a="http://schemas.openxmlformats.org/drawingml/2006/main">
+              <a:graphicData uri="http://schemas.openxmlformats.org/drawingml/2006/picture">
+                <pic:pic xmlns:pic="http://schemas.openxmlformats.org/drawingml/2006/picture">
+                  <pic:nvPicPr>
+                    <pic:cNvPr id="1065458833" name=""/>
+                    <pic:cNvPicPr/>
+                  </pic:nvPicPr>
+                  <pic:blipFill>
+                    <a:blip r:embed="rId13" cstate="print">
+                      <a:extLst>
+                        <a:ext uri="{28A0092B-C50C-407E-A947-70E740481C1C}">
+                          <a14:useLocalDpi xmlns:a14="http://schemas.microsoft.com/office/drawing/2010/main" val="0"/>
+                        </a:ext>
+                      </a:extLst>
+                    </a:blip>
+                    <a:stretch>
+                      <a:fillRect/>
+                    </a:stretch>
+                  </pic:blipFill>
+                  <pic:spPr>
+                    <a:xfrm>
+                      <a:off x="0" y="0"/>
+                      <a:ext cx="3986530" cy="3737610"/>
+                    </a:xfrm>
+                    <a:prstGeom prst="rect">
+                      <a:avLst/>
+                    </a:prstGeom>
+                  </pic:spPr>
+                </pic:pic>
+              </a:graphicData>
+            </a:graphic>
+            <wp14:sizeRelH relativeFrom="margin">
+              <wp14:pctWidth>0</wp14:pctWidth>
+            </wp14:sizeRelH>
+            <wp14:sizeRelV relativeFrom="margin">
+              <wp14:pctHeight>0</wp14:pctHeight>
+            </wp14:sizeRelV>
+          </wp:anchor>
+        </w:drawing>
+      </w:r>
+    </w:p>
+    <w:p>
+      <w:pPr>
+        <w:spacing w:after="0" w:line="240" w:lineRule="auto"/>
+        <w:ind w:right="720"/>
+      </w:pPr>
+    </w:p>
+    <w:p>
+      <w:pPr>
+        <w:spacing w:after="0" w:line="240" w:lineRule="auto"/>
+        <w:ind w:right="720"/>
+      </w:pPr>
+    </w:p>
+    <w:p>
+      <w:pPr>
+        <w:spacing w:after="0" w:line="240" w:lineRule="auto"/>
+        <w:ind w:right="720"/>
+      </w:pPr>
+    </w:p>
+    <w:p>
+      <w:pPr>
+        <w:spacing w:after="0" w:line="240" w:lineRule="auto"/>
+        <w:ind w:right="720"/>
+      </w:pPr>
+    </w:p>
+    <w:p>
+      <w:pPr>
+        <w:spacing w:after="0" w:line="240" w:lineRule="auto"/>
+        <w:ind w:right="720"/>
+      </w:pPr>
+    </w:p>
+    <w:p>
+      <w:pPr>
+        <w:spacing w:after="0" w:line="240" w:lineRule="auto"/>
+        <w:ind w:right="720"/>
+      </w:pPr>
+    </w:p>
+    <w:p>
+      <w:pPr>
+        <w:spacing w:after="0" w:line="240" w:lineRule="auto"/>
+        <w:ind w:right="720"/>
+      </w:pPr>
+    </w:p>
+    <w:p>
+      <w:pPr>
+        <w:spacing w:after="0" w:line="240" w:lineRule="auto"/>
+        <w:ind w:right="720"/>
+      </w:pPr>
+    </w:p>
+    <w:p>
+      <w:pPr>
+        <w:spacing w:after="0" w:line="240" w:lineRule="auto"/>
+        <w:ind w:right="720"/>
+      </w:pPr>
+    </w:p>
+    <w:p>
+      <w:pPr>
+        <w:spacing w:after="0" w:line="240" w:lineRule="auto"/>
+        <w:ind w:right="720"/>
+      </w:pPr>
+    </w:p>
+    <w:p>
+      <w:pPr>
+        <w:spacing w:after="0" w:line="240" w:lineRule="auto"/>
+        <w:ind w:right="720"/>
+      </w:pPr>
+    </w:p>
+    <w:p>
+      <w:pPr>
+        <w:spacing w:after="0" w:line="240" w:lineRule="auto"/>
+        <w:ind w:right="720"/>
+      </w:pPr>
+    </w:p>
+    <w:p>
+      <w:pPr>
+        <w:spacing w:after="0" w:line="240" w:lineRule="auto"/>
+        <w:ind w:right="720"/>
+      </w:pPr>
+    </w:p>
+    <w:p>
+      <w:pPr>
+        <w:spacing w:after="0" w:line="240" w:lineRule="auto"/>
+        <w:ind w:right="720"/>
+      </w:pPr>
+    </w:p>
+    <w:p>
+      <w:pPr>
+        <w:spacing w:after="0" w:line="240" w:lineRule="auto"/>
+        <w:ind w:right="720"/>
+      </w:pPr>
+    </w:p>
+    <w:p>
+      <w:pPr>
+        <w:spacing w:after="0" w:line="240" w:lineRule="auto"/>
+        <w:ind w:right="720"/>
+      </w:pPr>
+    </w:p>
+    <w:p>
+      <w:pPr>
+        <w:spacing w:after="0" w:line="240" w:lineRule="auto"/>
+        <w:ind w:right="720"/>
+      </w:pPr>
+    </w:p>
+    <w:p>
+      <w:pPr>
+        <w:spacing w:after="0" w:line="240" w:lineRule="auto"/>
+        <w:ind w:right="720"/>
+      </w:pPr>
+    </w:p>
+    <w:p>
+      <w:pPr>
+        <w:spacing w:after="0" w:line="240" w:lineRule="auto"/>
+        <w:ind w:right="720"/>
+      </w:pPr>
+    </w:p>
+    <w:p>
+      <w:pPr>
+        <w:spacing w:after="0" w:line="240" w:lineRule="auto"/>
+        <w:ind w:right="720"/>
+      </w:pPr>
+    </w:p>
+    <w:p>
+      <w:pPr>
+        <w:spacing w:after="0" w:line="240" w:lineRule="auto"/>
+        <w:ind w:right="720"/>
+      </w:pPr>
     </w:p>
     <w:p>
       <w:pPr>
@@ -1157,53 +1829,70 @@
         <w:spacing w:after="0" w:line="240" w:lineRule="auto"/>
       </w:pPr>
       <w:r>
+        <w:rPr>
+          <w:rtl/>
+        </w:rPr>
+        <w:drawing>
+          <wp:anchor distT="0" distB="0" distL="114300" distR="114300" simplePos="0" relativeHeight="251660288" behindDoc="0" locked="0" layoutInCell="1" allowOverlap="1" wp14:anchorId="4E0082A5" wp14:editId="2E51267D">
+            <wp:simplePos x="0" y="0"/>
+            <wp:positionH relativeFrom="margin">
+              <wp:align>left</wp:align>
+            </wp:positionH>
+            <wp:positionV relativeFrom="paragraph">
+              <wp:posOffset>276261</wp:posOffset>
+            </wp:positionV>
+            <wp:extent cx="5274310" cy="3287395"/>
+            <wp:effectExtent l="0" t="0" r="2540" b="8255"/>
+            <wp:wrapSquare wrapText="bothSides"/>
+            <wp:docPr id="1308425624" name="Picture 1"/>
+            <wp:cNvGraphicFramePr>
+              <a:graphicFrameLocks xmlns:a="http://schemas.openxmlformats.org/drawingml/2006/main" noChangeAspect="1"/>
+            </wp:cNvGraphicFramePr>
+            <a:graphic xmlns:a="http://schemas.openxmlformats.org/drawingml/2006/main">
+              <a:graphicData uri="http://schemas.openxmlformats.org/drawingml/2006/picture">
+                <pic:pic xmlns:pic="http://schemas.openxmlformats.org/drawingml/2006/picture">
+                  <pic:nvPicPr>
+                    <pic:cNvPr id="1308425624" name=""/>
+                    <pic:cNvPicPr/>
+                  </pic:nvPicPr>
+                  <pic:blipFill>
+                    <a:blip r:embed="rId14" cstate="print">
+                      <a:extLst>
+                        <a:ext uri="{28A0092B-C50C-407E-A947-70E740481C1C}">
+                          <a14:useLocalDpi xmlns:a14="http://schemas.microsoft.com/office/drawing/2010/main" val="0"/>
+                        </a:ext>
+                      </a:extLst>
+                    </a:blip>
+                    <a:stretch>
+                      <a:fillRect/>
+                    </a:stretch>
+                  </pic:blipFill>
+                  <pic:spPr>
+                    <a:xfrm>
+                      <a:off x="0" y="0"/>
+                      <a:ext cx="5274310" cy="3287395"/>
+                    </a:xfrm>
+                    <a:prstGeom prst="rect">
+                      <a:avLst/>
+                    </a:prstGeom>
+                  </pic:spPr>
+                </pic:pic>
+              </a:graphicData>
+            </a:graphic>
+          </wp:anchor>
+        </w:drawing>
+      </w:r>
+      <w:r>
         <w:t>Class Diagram</w:t>
       </w:r>
       <w:r>
         <w:tab/>
       </w:r>
     </w:p>
-    <w:p>
-      <w:r>
-        <w:t>[class diagram</w:t>
-      </w:r>
-      <w:r>
-        <w:rPr>
-          <w:rtl/>
-        </w:rPr>
-        <w:t xml:space="preserve"> שמתארת את המחלקות שלכם שמעורבות בתבנית (תיאור מלא שכולל </w:t>
-      </w:r>
-      <w:r>
-        <w:t>Properties</w:t>
-      </w:r>
-      <w:r>
-        <w:rPr>
-          <w:rtl/>
-        </w:rPr>
-        <w:t xml:space="preserve"> ו- </w:t>
-      </w:r>
-      <w:r>
-        <w:t>Methods</w:t>
-      </w:r>
-      <w:r>
-        <w:rPr>
-          <w:rtl/>
-        </w:rPr>
-        <w:t>) והיחסים ביניהם (תאור מלא עבור כל יחס כפי שלמדנו בכיתה). עבור כל מחלקה שלכם, כיתבו מי המקבילה שלה (אם יש כזו) בתבנית (</w:t>
-      </w:r>
-      <w:r>
-        <w:t>Pattern</w:t>
-      </w:r>
-      <w:r>
-        <w:rPr>
-          <w:rtl/>
-        </w:rPr>
-        <w:t>) שבחרתם</w:t>
-      </w:r>
-    </w:p>
+    <w:p/>
     <w:sectPr>
-      <w:headerReference w:type="default" r:id="rId9"/>
-      <w:footerReference w:type="default" r:id="rId10"/>
+      <w:headerReference w:type="default" r:id="rId15"/>
+      <w:footerReference w:type="default" r:id="rId16"/>
       <w:pgSz w:w="11906" w:h="16838"/>
       <w:pgMar w:top="825" w:right="1800" w:bottom="426" w:left="1800" w:header="142" w:footer="271" w:gutter="0"/>
       <w:pgNumType w:start="1"/>
@@ -1992,15 +2681,6 @@
   </w:num>
   <w:num w:numId="3" w16cid:durableId="226962597">
     <w:abstractNumId w:val="1"/>
-    <w:lvlOverride w:ilvl="0"/>
-    <w:lvlOverride w:ilvl="1"/>
-    <w:lvlOverride w:ilvl="2"/>
-    <w:lvlOverride w:ilvl="3"/>
-    <w:lvlOverride w:ilvl="4"/>
-    <w:lvlOverride w:ilvl="5"/>
-    <w:lvlOverride w:ilvl="6"/>
-    <w:lvlOverride w:ilvl="7"/>
-    <w:lvlOverride w:ilvl="8"/>
   </w:num>
 </w:numbering>
 </file>

</xml_diff>